<commit_message>
Pages and walkthrough at ring 48: measured numbers, test drive re-recorded, dev log entry
Co-Authored-By: Claude Fable 5.1 <noreply@anthropic.com>
</commit_message>
<xml_diff>
--- a/docs/Vesper - The Complete Walkthrough.docx
+++ b/docs/Vesper - The Complete Walkthrough.docx
@@ -197,7 +197,7 @@
           <w:sz w:val="22"/>
           <w:szCs w:val="22"/>
         </w:rPr>
-        <w:t xml:space="preserve">, no value ever), ring size 32, a genesis block tied to the newest Bitcoin block at launch, and a seed node on a rented server (kit in </w:t>
+        <w:t xml:space="preserve">, no value ever), ring size 48 (raised from 32 on 19 October, three times Monero's), a genesis block tied to the newest Bitcoin block at launch, and a seed node on a rented server (kit in </w:t>
       </w:r>
       <w:r>
         <w:rPr>
@@ -231,7 +231,7 @@
           <w:sz w:val="22"/>
           <w:szCs w:val="22"/>
         </w:rPr>
-        <w:t xml:space="preserve">Four privacy layers built and tested: hidden receivers (stealth addresses, as many per wallet as you like, and view keys), hidden amounts (commitments and one range proof per payment), hidden senders (rings of 32 with decoys drawn from measured spending, and key images), and network privacy (a payment travels node to node before any node broadcasts it, with the remaining leak measured by </w:t>
+        <w:t xml:space="preserve">Four privacy layers built and tested: hidden receivers (stealth addresses, as many per wallet as you like, and view keys), hidden amounts (commitments and one range proof per payment), hidden senders (rings of 48 with decoys drawn from measured spending, and key images), and network privacy (a payment travels node to node before any node broadcasts it, with the remaining leak measured by </w:t>
       </w:r>
       <w:r>
         <w:rPr>
@@ -539,7 +539,7 @@
           <w:sz w:val="22"/>
           <w:szCs w:val="22"/>
         </w:rPr>
-        <w:t xml:space="preserve">Receivers hidden, amounts hidden, sender hidden among 32 (twice Monero's ring, still not everyone), and the first broadcast of a payment comes from a relay rather than the sender's node, with an attacker who runs a tenth of the nodes still guessing right about a tenth of the time: as private as Monero's design, not more. Not "untraceable," not audited, not production software. Those words are earned later, in that order.</w:t>
+        <w:t xml:space="preserve">Receivers hidden, amounts hidden, sender hidden among 48 (three times Monero's ring, still not everyone), and the first broadcast of a payment comes from a relay rather than the sender's node, with an attacker who runs a tenth of the nodes still guessing right about a tenth of the time: as private as Monero's design, not more. Not "untraceable," not audited, not production software. Those words are earned later, in that order.</w:t>
       </w:r>
     </w:p>
     <w:p>
@@ -743,7 +743,7 @@
           <w:sz w:val="22"/>
           <w:szCs w:val="22"/>
         </w:rPr>
-        <w:t xml:space="preserve">A payment's input no longer names the output it spends. It lists a ring of exactly 32 existing outputs in sorted order and carries one CLSAG-style ring signature proving the signer owns one of them. A key image, a one-way marker derived from the real output's private key, is published; nodes keep the set of key images, so a second spend of the same output produces the same marker and is refused, with nobody learning which output it was. A pseudo-output commitment keeps the amount arithmetic working inside the ring. Decoys are drawn as ages from the spending pattern Monero's wallets use (fitted to real spends) and placed in the line of outputs with the chain's recent pace; an attacker who knows the rule names the real coin 3.0% of the time at the ring of 32, where 3.1% is fair (7.2% at 16), assuming Vesper's users spend like Monero's. The known weakness, stated everywhere: a crowd of 32 is twice Monero's crowd and still not everyone. You chose 32 on 18 October 2026 (54 ms per payment and 7.3 kB, against 45 ms and 5.1 kB at 16); 64 was measured too (82 ms, 11.7 kB, 1.8%) and judged not worth the cost until stage two's shape is known. The ring size is hashed into the genesis block. A coin, reward or payment, can be spent or used as a decoy only once it is 10 blocks old (Monero waits 20), so a fresh chain needs 32 such coins, about 42 blocks or ten to twenty minutes, before its first payment. Wallets fetch a ring's 32 members together, their own coin among them, so an honest node cannot tell which is real; a dishonest node could feed chosen decoys, which is why real privacy means running your own node.</w:t>
+        <w:t xml:space="preserve">A payment's input no longer names the output it spends. It lists a ring of exactly 48 existing outputs in sorted order and carries one CLSAG-style ring signature proving the signer owns one of them. A key image, a one-way marker derived from the real output's private key, is published; nodes keep the set of key images, so a second spend of the same output produces the same marker and is refused, with nobody learning which output it was. A pseudo-output commitment keeps the amount arithmetic working inside the ring. Decoys are drawn as ages from the spending pattern Monero's wallets use (fitted to real spends) and placed in the line of outputs with the chain's recent pace; an attacker who knows the rule names the real coin 2.1% of the time at the ring of 48, where 2.1% is fair (3.0% at 32, 6.2% at 16), assuming Vesper's users spend like Monero's. The known weakness, stated everywhere: a crowd of 48 is three times Monero's crowd and still not everyone. You chose 48 on 19 October 2026 (64 ms per payment and 9.5 kB, against 45 ms and 5.1 kB at 16 and 54 ms and 7.3 kB at 32); 64 was measured too (82 ms, 11.7 kB, 1.8%) and judged not worth the extra cost until stage two's shape is known. The ring size is hashed into the genesis block. A coin, reward or payment, can be spent or used as a decoy only once it is 10 blocks old (Monero waits 20), so a fresh chain needs 48 such coins, about 58 blocks or fifteen to thirty minutes, before its first payment. Wallets fetch a ring's 48 members together, their own coin among them, so an honest node cannot tell which is real; a dishonest node could feed chosen decoys, which is why real privacy means running your own node.</w:t>
       </w:r>
     </w:p>
     <w:p>
@@ -1263,7 +1263,7 @@
                 <w:sz w:val="22"/>
                 <w:szCs w:val="22"/>
               </w:rPr>
-              <w:t xml:space="preserve">one of 32</w:t>
+              <w:t xml:space="preserve">one of 48</w:t>
             </w:r>
           </w:p>
         </w:tc>
@@ -1325,7 +1325,7 @@
                 <w:sz w:val="22"/>
                 <w:szCs w:val="22"/>
               </w:rPr>
-              <w:t xml:space="preserve">one of 32</w:t>
+              <w:t xml:space="preserve">one of 48</w:t>
             </w:r>
           </w:p>
         </w:tc>
@@ -1701,7 +1701,7 @@
                 <w:sz w:val="22"/>
                 <w:szCs w:val="22"/>
               </w:rPr>
-              <w:t xml:space="preserve">about 0.4 s at a ring of 32 while the PC also mines (204 ms at 16, idle)</w:t>
+              <w:t xml:space="preserve">about half a second at a ring of 48 while the PC also mines (204 ms at 16, idle)</w:t>
             </w:r>
           </w:p>
         </w:tc>
@@ -1763,7 +1763,7 @@
                 <w:sz w:val="22"/>
                 <w:szCs w:val="22"/>
               </w:rPr>
-              <w:t xml:space="preserve">54 ms at the ring of 32 (45 at 16)</w:t>
+              <w:t xml:space="preserve">64 ms at the ring of 48 (45 at 16, 54 at 32)</w:t>
             </w:r>
           </w:p>
         </w:tc>
@@ -1825,7 +1825,7 @@
                 <w:sz w:val="22"/>
                 <w:szCs w:val="22"/>
               </w:rPr>
-              <w:t xml:space="preserve">23 ms per payment (15.1 at a ring of 16)</w:t>
+              <w:t xml:space="preserve">33 ms per payment (15.1 at 16, 23 at 32)</w:t>
             </w:r>
           </w:p>
         </w:tc>
@@ -1887,7 +1887,7 @@
                 <w:sz w:val="22"/>
                 <w:szCs w:val="22"/>
               </w:rPr>
-              <w:t xml:space="preserve">18 ms to sign, 17 ms to verify at a ring of 32 (9 and 10 at 16)</w:t>
+              <w:t xml:space="preserve">26 ms to sign, 26 ms to verify at a ring of 48 (18 and 17 at 32; 9 and 10 at 16)</w:t>
             </w:r>
           </w:p>
         </w:tc>
@@ -2383,27 +2383,27 @@
                 <w:sz w:val="22"/>
                 <w:szCs w:val="22"/>
               </w:rPr>
-              <w:t xml:space="preserve">about 3.1 kB binary, 7.3 kB as JSON (2.2 and 5.1 at a ring of 16)</w:t>
-            </w:r>
-          </w:p>
-        </w:tc>
-        <w:tc>
-          <w:tcPr>
-            <w:tcBorders>
-              <w:top w:val="single" w:color="BBBBBB" w:sz="4"/>
-              <w:left w:val="single" w:color="BBBBBB" w:sz="4"/>
-              <w:bottom w:val="single" w:color="BBBBBB" w:sz="4"/>
-              <w:right w:val="single" w:color="BBBBBB" w:sz="4"/>
-            </w:tcBorders>
-          </w:tcPr>
-          <w:p>
-            <w:r>
-              <w:rPr>
-                <w:rFonts w:ascii="Calibri" w:cs="Calibri" w:eastAsia="Calibri" w:hAnsi="Calibri"/>
-                <w:sz w:val="22"/>
-                <w:szCs w:val="22"/>
-              </w:rPr>
-              <w:t xml:space="preserve">1,152 bytes ring signature, one 736-byte range proof</w:t>
+              <w:t xml:space="preserve">about 4 kB binary, 9.5 kB as JSON (3.1 and 7.3 at 32; 2.2 and 5.1 at 16)</w:t>
+            </w:r>
+          </w:p>
+        </w:tc>
+        <w:tc>
+          <w:tcPr>
+            <w:tcBorders>
+              <w:top w:val="single" w:color="BBBBBB" w:sz="4"/>
+              <w:left w:val="single" w:color="BBBBBB" w:sz="4"/>
+              <w:bottom w:val="single" w:color="BBBBBB" w:sz="4"/>
+              <w:right w:val="single" w:color="BBBBBB" w:sz="4"/>
+            </w:tcBorders>
+          </w:tcPr>
+          <w:p>
+            <w:r>
+              <w:rPr>
+                <w:rFonts w:ascii="Calibri" w:cs="Calibri" w:eastAsia="Calibri" w:hAnsi="Calibri"/>
+                <w:sz w:val="22"/>
+                <w:szCs w:val="22"/>
+              </w:rPr>
+              <w:t xml:space="preserve">1,600 bytes ring signature, one 736-byte range proof</w:t>
             </w:r>
           </w:p>
         </w:tc>
@@ -2445,27 +2445,27 @@
                 <w:sz w:val="22"/>
                 <w:szCs w:val="22"/>
               </w:rPr>
-              <w:t xml:space="preserve">4 ms, then 8.4, then 18.6, then 15.1, then 23</w:t>
-            </w:r>
-          </w:p>
-        </w:tc>
-        <w:tc>
-          <w:tcPr>
-            <w:tcBorders>
-              <w:top w:val="single" w:color="BBBBBB" w:sz="4"/>
-              <w:left w:val="single" w:color="BBBBBB" w:sz="4"/>
-              <w:bottom w:val="single" w:color="BBBBBB" w:sz="4"/>
-              <w:right w:val="single" w:color="BBBBBB" w:sz="4"/>
-            </w:tcBorders>
-          </w:tcPr>
-          <w:p>
-            <w:r>
-              <w:rPr>
-                <w:rFonts w:ascii="Calibri" w:cs="Calibri" w:eastAsia="Calibri" w:hAnsi="Calibri"/>
-                <w:sz w:val="22"/>
-                <w:szCs w:val="22"/>
-              </w:rPr>
-              <w:t xml:space="preserve">receivers, amounts, senders (ring 16), one joint proof per payment, ring of 32</w:t>
+              <w:t xml:space="preserve">4 ms, then 8.4, then 18.6, then 15.1, then 23, then 33</w:t>
+            </w:r>
+          </w:p>
+        </w:tc>
+        <w:tc>
+          <w:tcPr>
+            <w:tcBorders>
+              <w:top w:val="single" w:color="BBBBBB" w:sz="4"/>
+              <w:left w:val="single" w:color="BBBBBB" w:sz="4"/>
+              <w:bottom w:val="single" w:color="BBBBBB" w:sz="4"/>
+              <w:right w:val="single" w:color="BBBBBB" w:sz="4"/>
+            </w:tcBorders>
+          </w:tcPr>
+          <w:p>
+            <w:r>
+              <w:rPr>
+                <w:rFonts w:ascii="Calibri" w:cs="Calibri" w:eastAsia="Calibri" w:hAnsi="Calibri"/>
+                <w:sz w:val="22"/>
+                <w:szCs w:val="22"/>
+              </w:rPr>
+              <w:t xml:space="preserve">receivers, amounts, senders (ring 16), one joint proof per payment, ring of 32, ring of 48</w:t>
             </w:r>
           </w:p>
         </w:tc>
@@ -3272,7 +3272,7 @@
           <w:sz w:val="22"/>
           <w:szCs w:val="22"/>
         </w:rPr>
-        <w:t xml:space="preserve">, which runs the whole test on two throwaway nodes with a throwaway network of their own. Alice mined 41 blocks (32 coins old enough after 176 seconds of fast test mining) and paid Bob 12.5 tVESP; her node handed the payment quietly to one peer instead of broadcasting it; Bob read it on his own node among 45 outputs in 0.0 seconds; his accountant's view key saw the same payment and could not spend; a search of the raw chain file for both addresses and the amount found nothing; the transaction on chain showed a ring of 32, a key image, a 32-response signature, two sealed outputs and one 736-byte range proof, 7,303 bytes of JSON; Bob paid 3 back from his node once his coin was 10 blocks old, and his node passed it to one peer rather than broadcasting; his wallet then showed 9.49999 tVESP; node 2 re-validated all 55 blocks offline in 2.6 seconds; an overspend, a replayed transaction, a mistyped address and a view-key file trying to spend were all refused with plain-English reasons, and a doctored chain file was named by block and repaired from the other node. The script ends "14 of 14 checks behaved as the test drive page says." The full transcript with commands is on the test-drive page.</w:t>
+        <w:t xml:space="preserve">, which runs the whole test on two throwaway nodes with a throwaway network of their own. Alice mined 57 blocks (48 coins old enough after 499 seconds of fast test mining) and paid Bob 12.5 tVESP; her node handed the payment quietly to one peer instead of broadcasting it; Bob read it on his own node among 61 outputs in 0.0 seconds; his accountant's view key saw the same payment and could not spend; a search of the raw chain file for both addresses and the amount found nothing; the transaction on chain showed a ring of 48, a key image, a 48-response signature, two sealed outputs and one 736-byte range proof, 9,479 bytes of JSON; Bob paid 3 back from his node once his coin was 10 blocks old, and his node passed it to one peer rather than broadcasting; his wallet then showed 9.49999 tVESP; node 2 re-validated all 70 blocks offline in 2.0 seconds; an overspend, a replayed transaction, a mistyped address and a view-key file trying to spend were all refused with plain-English reasons, and a doctored chain file was named by block and repaired from the other node. The script ends "14 of 14 checks behaved as the test drive page says." The full transcript with commands is on the test-drive page.</w:t>
       </w:r>
     </w:p>
     <w:p>
@@ -4150,47 +4150,47 @@
                 <w:sz w:val="22"/>
                 <w:szCs w:val="22"/>
               </w:rPr>
-              <w:t xml:space="preserve">32 (decided 18 October 2026)</w:t>
-            </w:r>
-          </w:p>
-        </w:tc>
-        <w:tc>
-          <w:tcPr>
-            <w:tcBorders>
-              <w:top w:val="single" w:color="BBBBBB" w:sz="4"/>
-              <w:left w:val="single" w:color="BBBBBB" w:sz="4"/>
-              <w:bottom w:val="single" w:color="BBBBBB" w:sz="4"/>
-              <w:right w:val="single" w:color="BBBBBB" w:sz="4"/>
-            </w:tcBorders>
-          </w:tcPr>
-          <w:p>
-            <w:r>
-              <w:rPr>
-                <w:rFonts w:ascii="Calibri" w:cs="Calibri" w:eastAsia="Calibri" w:hAnsi="Calibri"/>
-                <w:sz w:val="22"/>
-                <w:szCs w:val="22"/>
-              </w:rPr>
-              <w:t xml:space="preserve">keep 32 unless stage two replaces the ring</w:t>
-            </w:r>
-          </w:p>
-        </w:tc>
-        <w:tc>
-          <w:tcPr>
-            <w:tcBorders>
-              <w:top w:val="single" w:color="BBBBBB" w:sz="4"/>
-              <w:left w:val="single" w:color="BBBBBB" w:sz="4"/>
-              <w:bottom w:val="single" w:color="BBBBBB" w:sz="4"/>
-              <w:right w:val="single" w:color="BBBBBB" w:sz="4"/>
-            </w:tcBorders>
-          </w:tcPr>
-          <w:p>
-            <w:r>
-              <w:rPr>
-                <w:rFonts w:ascii="Calibri" w:cs="Calibri" w:eastAsia="Calibri" w:hAnsi="Calibri"/>
-                <w:sz w:val="22"/>
-                <w:szCs w:val="22"/>
-              </w:rPr>
-              <w:t xml:space="preserve">hashed into block 0; 16 / 32 / 64 measured at 45 / 54 / 82 ms per payment, 5.1 / 7.3 / 11.7 kB, and 5.5 / 3.0 / 1.8% for an informed attacker</w:t>
+              <w:t xml:space="preserve">48 (decided 19 October 2026, three times Monero's)</w:t>
+            </w:r>
+          </w:p>
+        </w:tc>
+        <w:tc>
+          <w:tcPr>
+            <w:tcBorders>
+              <w:top w:val="single" w:color="BBBBBB" w:sz="4"/>
+              <w:left w:val="single" w:color="BBBBBB" w:sz="4"/>
+              <w:bottom w:val="single" w:color="BBBBBB" w:sz="4"/>
+              <w:right w:val="single" w:color="BBBBBB" w:sz="4"/>
+            </w:tcBorders>
+          </w:tcPr>
+          <w:p>
+            <w:r>
+              <w:rPr>
+                <w:rFonts w:ascii="Calibri" w:cs="Calibri" w:eastAsia="Calibri" w:hAnsi="Calibri"/>
+                <w:sz w:val="22"/>
+                <w:szCs w:val="22"/>
+              </w:rPr>
+              <w:t xml:space="preserve">keep 48 unless stage two replaces the ring</w:t>
+            </w:r>
+          </w:p>
+        </w:tc>
+        <w:tc>
+          <w:tcPr>
+            <w:tcBorders>
+              <w:top w:val="single" w:color="BBBBBB" w:sz="4"/>
+              <w:left w:val="single" w:color="BBBBBB" w:sz="4"/>
+              <w:bottom w:val="single" w:color="BBBBBB" w:sz="4"/>
+              <w:right w:val="single" w:color="BBBBBB" w:sz="4"/>
+            </w:tcBorders>
+          </w:tcPr>
+          <w:p>
+            <w:r>
+              <w:rPr>
+                <w:rFonts w:ascii="Calibri" w:cs="Calibri" w:eastAsia="Calibri" w:hAnsi="Calibri"/>
+                <w:sz w:val="22"/>
+                <w:szCs w:val="22"/>
+              </w:rPr>
+              <w:t xml:space="preserve">hashed into block 0; 16 / 32 / 48 / 64 measured at 45 / 54 / 64 / 82 ms per payment, 5.1 / 7.3 / 9.5 / 11.7 kB, and 6.2 / 3.0 / 2.1 / 1.8% for an informed attacker</w:t>
             </w:r>
           </w:p>
         </w:tc>
@@ -4492,7 +4492,7 @@
           <w:sz w:val="22"/>
           <w:szCs w:val="22"/>
         </w:rPr>
-        <w:t xml:space="preserve">1. Testnet-1 (decided 18 October 2026, launching with the publication; ring 32, phase 4 and its leak test shipped 15 October) with a standing bounty for anyone who can trace a payment.</w:t>
+        <w:t xml:space="preserve">1. Testnet-1 (decided 18 October 2026, launching with the publication; ring 48 from 19 October, phase 4 and its leak test shipped 15 October) with a standing bounty for anyone who can trace a payment.</w:t>
       </w:r>
     </w:p>
     <w:p>
@@ -6982,7 +6982,7 @@
                 <w:sz w:val="22"/>
                 <w:szCs w:val="22"/>
               </w:rPr>
-              <w:t xml:space="preserve">The 32 outputs an input could be spending; sorted; the real one is among them.</w:t>
+              <w:t xml:space="preserve">The 48 outputs an input could be spending; sorted; the real one is among them.</w:t>
             </w:r>
           </w:p>
         </w:tc>

</xml_diff>

<commit_message>
Pages: testnet-1 is open, seed node on the Join page and the founding-node roll, mainnet emission stated as planned; ignore Word lock files
Co-Authored-By: Claude Fable 5.1 <noreply@anthropic.com>
</commit_message>
<xml_diff>
--- a/docs/Vesper - The Complete Walkthrough.docx
+++ b/docs/Vesper - The Complete Walkthrough.docx
@@ -3678,7 +3678,7 @@
                 <w:sz w:val="22"/>
                 <w:szCs w:val="22"/>
               </w:rPr>
-              <w:t xml:space="preserve">smooth decreasing curve with a small tail emission forever</w:t>
+              <w:t xml:space="preserve">DECIDED: a smooth curve (each block pays 1/4,194,304 of an 18 M main curve not yet issued, 4.29 per 30 s block at first), then a tail from about year 13 of 0.15 per 30 s block, down 0.01 every 6 years to 0.05 at about year 73, then 0.05 forever</w:t>
             </w:r>
           </w:p>
         </w:tc>
@@ -3760,27 +3760,27 @@
                 <w:sz w:val="22"/>
                 <w:szCs w:val="22"/>
               </w:rPr>
-              <w:t xml:space="preserve">no hard cap (the tail), curve published with genesis</w:t>
-            </w:r>
-          </w:p>
-        </w:tc>
-        <w:tc>
-          <w:tcPr>
-            <w:tcBorders>
-              <w:top w:val="single" w:color="BBBBBB" w:sz="4"/>
-              <w:left w:val="single" w:color="BBBBBB" w:sz="4"/>
-              <w:bottom w:val="single" w:color="BBBBBB" w:sz="4"/>
-              <w:right w:val="single" w:color="BBBBBB" w:sz="4"/>
-            </w:tcBorders>
-          </w:tcPr>
-          <w:p>
-            <w:r>
-              <w:rPr>
-                <w:rFonts w:ascii="Calibri" w:cs="Calibri" w:eastAsia="Calibri" w:hAnsi="Calibri"/>
-                <w:sz w:val="22"/>
-                <w:szCs w:val="22"/>
-              </w:rPr>
-              <w:t xml:space="preserve">the tail makes inflation trend to zero without a cliff</w:t>
+              <w:t xml:space="preserve">DECIDED: no hard cap, but nearly fixed: about 21.4 M at year 43, 25.4 M at year 100</w:t>
+            </w:r>
+          </w:p>
+        </w:tc>
+        <w:tc>
+          <w:tcPr>
+            <w:tcBorders>
+              <w:top w:val="single" w:color="BBBBBB" w:sz="4"/>
+              <w:left w:val="single" w:color="BBBBBB" w:sz="4"/>
+              <w:bottom w:val="single" w:color="BBBBBB" w:sz="4"/>
+              <w:right w:val="single" w:color="BBBBBB" w:sz="4"/>
+            </w:tcBorders>
+          </w:tcPr>
+          <w:p>
+            <w:r>
+              <w:rPr>
+                <w:rFonts w:ascii="Calibri" w:cs="Calibri" w:eastAsia="Calibri" w:hAnsi="Calibri"/>
+                <w:sz w:val="22"/>
+                <w:szCs w:val="22"/>
+              </w:rPr>
+              <w:t xml:space="preserve">inflation about 1% at year 13, 0.54% at year 43, about 0.2% from year 74 and falling, without a cliff</w:t>
             </w:r>
           </w:p>
         </w:tc>
@@ -4907,27 +4907,27 @@
                 <w:sz w:val="22"/>
                 <w:szCs w:val="22"/>
               </w:rPr>
-              <w:t xml:space="preserve">launching with the publication, 19 October 2026</w:t>
-            </w:r>
-          </w:p>
-        </w:tc>
-        <w:tc>
-          <w:tcPr>
-            <w:tcBorders>
-              <w:top w:val="single" w:color="BBBBBB" w:sz="4"/>
-              <w:left w:val="single" w:color="BBBBBB" w:sz="4"/>
-              <w:bottom w:val="single" w:color="BBBBBB" w:sz="4"/>
-              <w:right w:val="single" w:color="BBBBBB" w:sz="4"/>
-            </w:tcBorders>
-          </w:tcPr>
-          <w:p>
-            <w:r>
-              <w:rPr>
-                <w:rFonts w:ascii="Calibri" w:cs="Calibri" w:eastAsia="Calibri" w:hAnsi="Calibri"/>
-                <w:sz w:val="22"/>
-                <w:szCs w:val="22"/>
-              </w:rPr>
-              <w:t xml:space="preserve">the seed node on a rented server (your step), then node runners and the bounty pool</w:t>
+              <w:t xml:space="preserve">open: code public 19 October 2026, first seed node live 23 October 2026 at http://207.148.85.83:8880</w:t>
+            </w:r>
+          </w:p>
+        </w:tc>
+        <w:tc>
+          <w:tcPr>
+            <w:tcBorders>
+              <w:top w:val="single" w:color="BBBBBB" w:sz="4"/>
+              <w:left w:val="single" w:color="BBBBBB" w:sz="4"/>
+              <w:bottom w:val="single" w:color="BBBBBB" w:sz="4"/>
+              <w:right w:val="single" w:color="BBBBBB" w:sz="4"/>
+            </w:tcBorders>
+          </w:tcPr>
+          <w:p>
+            <w:r>
+              <w:rPr>
+                <w:rFonts w:ascii="Calibri" w:cs="Calibri" w:eastAsia="Calibri" w:hAnsi="Calibri"/>
+                <w:sz w:val="22"/>
+                <w:szCs w:val="22"/>
+              </w:rPr>
+              <w:t xml:space="preserve">node runners, the bounty pool, a second seed node on another provider for resilience</w:t>
             </w:r>
           </w:p>
         </w:tc>
@@ -5348,7 +5348,7 @@
           <w:sz w:val="22"/>
           <w:szCs w:val="22"/>
         </w:rPr>
-        <w:t xml:space="preserve">7. Rent the seed server (a small Ubuntu machine, paid in a way that does not point at you), run </w:t>
+        <w:t xml:space="preserve">7. Keep the seed server current: after each pushed code change, log in and re-run </w:t>
       </w:r>
       <w:r>
         <w:rPr>
@@ -5356,47 +5356,15 @@
           <w:sz w:val="20"/>
           <w:szCs w:val="20"/>
         </w:rPr>
-        <w:t xml:space="preserve">deploy/setup-seed.sh</w:t>
-      </w:r>
-      <w:r>
-        <w:rPr>
-          <w:rFonts w:ascii="Calibri" w:cs="Calibri" w:eastAsia="Calibri" w:hAnsi="Calibri"/>
-          <w:sz w:val="22"/>
-          <w:szCs w:val="22"/>
-        </w:rPr>
-        <w:t xml:space="preserve"> on it as </w:t>
-      </w:r>
-      <w:r>
-        <w:rPr>
-          <w:rFonts w:ascii="Consolas" w:cs="Consolas" w:eastAsia="Consolas" w:hAnsi="Consolas"/>
-          <w:sz w:val="20"/>
-          <w:szCs w:val="20"/>
-        </w:rPr>
-        <w:t xml:space="preserve">deploy/README.md</w:t>
-      </w:r>
-      <w:r>
-        <w:rPr>
-          <w:rFonts w:ascii="Calibri" w:cs="Calibri" w:eastAsia="Calibri" w:hAnsi="Calibri"/>
-          <w:sz w:val="22"/>
-          <w:szCs w:val="22"/>
-        </w:rPr>
-        <w:t xml:space="preserve"> describes, and send back its address so it goes into </w:t>
-      </w:r>
-      <w:r>
-        <w:rPr>
-          <w:rFonts w:ascii="Consolas" w:cs="Consolas" w:eastAsia="Consolas" w:hAnsi="Consolas"/>
-          <w:sz w:val="20"/>
-          <w:szCs w:val="20"/>
-        </w:rPr>
-        <w:t xml:space="preserve">config.json</w:t>
-      </w:r>
-      <w:r>
-        <w:rPr>
-          <w:rFonts w:ascii="Calibri" w:cs="Calibri" w:eastAsia="Calibri" w:hAnsi="Calibri"/>
-          <w:sz w:val="22"/>
-          <w:szCs w:val="22"/>
-        </w:rPr>
-        <w:t xml:space="preserve"> and onto the Join page.</w:t>
+        <w:t xml:space="preserve">sudo bash /opt/vesper/deploy/setup-seed.sh https://github.com/vesperorg/vesper</w:t>
+      </w:r>
+      <w:r>
+        <w:rPr>
+          <w:rFonts w:ascii="Calibri" w:cs="Calibri" w:eastAsia="Calibri" w:hAnsi="Calibri"/>
+          <w:sz w:val="22"/>
+          <w:szCs w:val="22"/>
+        </w:rPr>
+        <w:t xml:space="preserve"> (it re-runs the 44 checks before restarting the node). When there are a few outside node runners, add a second seed on a different provider so the network survives one server dying; it is optional until then.</w:t>
       </w:r>
     </w:p>
     <w:p>

</xml_diff>

<commit_message>
Pages and walkthrough: one operator-less mining pool, planned for mainnet, stated with the honest limit
Co-Authored-By: Claude Fable 5.1 <noreply@anthropic.com>
</commit_message>
<xml_diff>
--- a/docs/Vesper - The Complete Walkthrough.docx
+++ b/docs/Vesper - The Complete Walkthrough.docx
@@ -4437,6 +4437,88 @@
                 <w:szCs w:val="22"/>
               </w:rPr>
               <w:t xml:space="preserve">not provable on a private chain without glass-box outputs, and it starves miners</w:t>
+            </w:r>
+          </w:p>
+        </w:tc>
+      </w:tr>
+      <w:tr>
+        <w:tc>
+          <w:tcPr>
+            <w:tcBorders>
+              <w:top w:val="single" w:color="BBBBBB" w:sz="4"/>
+              <w:left w:val="single" w:color="BBBBBB" w:sz="4"/>
+              <w:bottom w:val="single" w:color="BBBBBB" w:sz="4"/>
+              <w:right w:val="single" w:color="BBBBBB" w:sz="4"/>
+            </w:tcBorders>
+          </w:tcPr>
+          <w:p>
+            <w:r>
+              <w:rPr>
+                <w:rFonts w:ascii="Calibri" w:cs="Calibri" w:eastAsia="Calibri" w:hAnsi="Calibri"/>
+                <w:sz w:val="22"/>
+                <w:szCs w:val="22"/>
+              </w:rPr>
+              <w:t xml:space="preserve">Mining pools</w:t>
+            </w:r>
+          </w:p>
+        </w:tc>
+        <w:tc>
+          <w:tcPr>
+            <w:tcBorders>
+              <w:top w:val="single" w:color="BBBBBB" w:sz="4"/>
+              <w:left w:val="single" w:color="BBBBBB" w:sz="4"/>
+              <w:bottom w:val="single" w:color="BBBBBB" w:sz="4"/>
+              <w:right w:val="single" w:color="BBBBBB" w:sz="4"/>
+            </w:tcBorders>
+          </w:tcPr>
+          <w:p>
+            <w:r>
+              <w:rPr>
+                <w:rFonts w:ascii="Calibri" w:cs="Calibri" w:eastAsia="Calibri" w:hAnsi="Calibri"/>
+                <w:sz w:val="22"/>
+                <w:szCs w:val="22"/>
+              </w:rPr>
+              <w:t xml:space="preserve">none</w:t>
+            </w:r>
+          </w:p>
+        </w:tc>
+        <w:tc>
+          <w:tcPr>
+            <w:tcBorders>
+              <w:top w:val="single" w:color="BBBBBB" w:sz="4"/>
+              <w:left w:val="single" w:color="BBBBBB" w:sz="4"/>
+              <w:bottom w:val="single" w:color="BBBBBB" w:sz="4"/>
+              <w:right w:val="single" w:color="BBBBBB" w:sz="4"/>
+            </w:tcBorders>
+          </w:tcPr>
+          <w:p>
+            <w:r>
+              <w:rPr>
+                <w:rFonts w:ascii="Calibri" w:cs="Calibri" w:eastAsia="Calibri" w:hAnsi="Calibri"/>
+                <w:sz w:val="22"/>
+                <w:szCs w:val="22"/>
+              </w:rPr>
+              <w:t xml:space="preserve">DECIDED 27 October 2026: one pool with no operator, built into the node after Monero's P2Pool (share chain, last ~2,160 shares paid straight to members' wallets at one-time keys, members build their own blocks); the only pool the software supports</w:t>
+            </w:r>
+          </w:p>
+        </w:tc>
+        <w:tc>
+          <w:tcPr>
+            <w:tcBorders>
+              <w:top w:val="single" w:color="BBBBBB" w:sz="4"/>
+              <w:left w:val="single" w:color="BBBBBB" w:sz="4"/>
+              <w:bottom w:val="single" w:color="BBBBBB" w:sz="4"/>
+              <w:right w:val="single" w:color="BBBBBB" w:sz="4"/>
+            </w:tcBorders>
+          </w:tcPr>
+          <w:p>
+            <w:r>
+              <w:rPr>
+                <w:rFonts w:ascii="Calibri" w:cs="Calibri" w:eastAsia="Calibri" w:hAnsi="Calibri"/>
+                <w:sz w:val="22"/>
+                <w:szCs w:val="22"/>
+              </w:rPr>
+              <w:t xml:space="preserve">an operator pool builds every block, holds payouts and learns every member's address; the protocol cannot forbid one, so "only" means built-in and supported; needs a coinbase with hundreds of outputs (16 today), which changes block 0</w:t>
             </w:r>
           </w:p>
         </w:tc>

</xml_diff>

<commit_message>
The self-test has 45 checks: pages, beginner guide and walkthrough updated
Co-Authored-By: Claude Fable 5.1 <noreply@anthropic.com>
</commit_message>
<xml_diff>
--- a/docs/Vesper - The Complete Walkthrough.docx
+++ b/docs/Vesper - The Complete Walkthrough.docx
@@ -163,7 +163,7 @@
           <w:sz w:val="22"/>
           <w:szCs w:val="22"/>
         </w:rPr>
-        <w:t xml:space="preserve"> and public on GitHub under the Vesper organisation. It has a node with an explorer, a command-line wallet, a peer network, a multi-core miner, a one-click test drive, and a 44-check self-test that passes (node v0.9.0).</w:t>
+        <w:t xml:space="preserve"> and public on GitHub under the Vesper organisation. It has a node with an explorer, a command-line wallet, a peer network, a multi-core miner, a one-click test drive, and a 45-check self-test that passes (node v0.9.1).</w:t>
       </w:r>
     </w:p>
     <w:p>
@@ -5446,7 +5446,7 @@
           <w:sz w:val="22"/>
           <w:szCs w:val="22"/>
         </w:rPr>
-        <w:t xml:space="preserve"> (it re-runs the 44 checks before restarting the node). When there are a few outside node runners, add a second seed on a different provider so the network survives one server dying; it is optional until then.</w:t>
+        <w:t xml:space="preserve"> (it re-runs the 45 checks before restarting the node). When there are a few outside node runners, add a second seed on a different provider so the network survives one server dying; it is optional until then.</w:t>
       </w:r>
     </w:p>
     <w:p>

</xml_diff>